<commit_message>
actualizare cod pt vers 6.0, eliminare caractere romanesti la import client din api, adaugare tabele extra in db
</commit_message>
<xml_diff>
--- a/pyinstaller command ok.docx
+++ b/pyinstaller command ok.docx
@@ -155,16 +155,16 @@
     </w:p>
     <w:p>
       <w:r>
-        <w:t>--name Gestiune_clienti_sqlite_portabil_v</w:t>
-      </w:r>
-      <w:r>
-        <w:t>5</w:t>
+        <w:t>--name Gestiune_clienti_sqlite_v</w:t>
+      </w:r>
+      <w:r>
+        <w:t>6</w:t>
       </w:r>
       <w:r>
         <w:t>.</w:t>
       </w:r>
       <w:r>
-        <w:t>2</w:t>
+        <w:t>0</w:t>
       </w:r>
       <w:r>
         <w:t xml:space="preserve"> gestiune_clienti_sqlite.py</w:t>

</xml_diff>